<commit_message>
docs: introduce a comprehensive study guide for the DevRev System Design Round, detailing reading order and key documents across multiple projects. Additionally, enhance existing documentation with cross-cutting concerns related to identity, secrets management, observability standards, and CI/CD practices, ensuring a robust framework for system design discussions.
</commit_message>
<xml_diff>
--- a/DevRev_Preparation/System_Design_Round/DevRev-SystemDesign-Prep.docx
+++ b/DevRev_Preparation/System_Design_Round/DevRev-SystemDesign-Prep.docx
@@ -1338,6 +1338,20 @@
     </w:p>
     <w:p>
       <w:pPr>
+        <w:spacing w:after="120" w:before="0"/>
+        <w:ind w:left="560"/>
+      </w:pPr>
+      <w:r>
+        <w:rPr>
+          <w:i/>
+          <w:color w:val="2E5C8A"/>
+          <w:sz w:val="18"/>
+        </w:rPr>
+        <w:t>→ Read: agent_platform/docs/04 §3.1 — the safety mechanisms are real; the non-technical authoring surface is not</w:t>
+      </w:r>
+    </w:p>
+    <w:p>
+      <w:pPr>
         <w:pStyle w:val="ListParagraph"/>
         <w:numPr>
           <w:ilvl w:val="0"/>
@@ -1355,6 +1369,20 @@
     </w:p>
     <w:p>
       <w:pPr>
+        <w:spacing w:after="120" w:before="0"/>
+        <w:ind w:left="560"/>
+      </w:pPr>
+      <w:r>
+        <w:rPr>
+          <w:i/>
+          <w:color w:val="2E5C8A"/>
+          <w:sz w:val="18"/>
+        </w:rPr>
+        <w:t>→ Read: agent_platform/docs/04 §3.1 (built) + enterprise_rag_platform/docs/10 §2 (multi-channel delivery, general pattern)</w:t>
+      </w:r>
+    </w:p>
+    <w:p>
+      <w:pPr>
         <w:pStyle w:val="ListParagraph"/>
         <w:numPr>
           <w:ilvl w:val="0"/>
@@ -1368,6 +1396,20 @@
           <w:szCs w:val="21"/>
         </w:rPr>
         <w:t xml:space="preserve">Expect follow-ups on how a user tests a workflow before enabling it, and how you stop a bad workflow mid-flight</w:t>
+      </w:r>
+    </w:p>
+    <w:p>
+      <w:pPr>
+        <w:spacing w:after="120" w:before="0"/>
+        <w:ind w:left="560"/>
+      </w:pPr>
+      <w:r>
+        <w:rPr>
+          <w:i/>
+          <w:color w:val="2E5C8A"/>
+          <w:sz w:val="18"/>
+        </w:rPr>
+        <w:t>→ Read: agent_platform/docs/04 §3.1 — built (test mode + a run-halting budget), both demoed</w:t>
       </w:r>
     </w:p>
     <w:p>
@@ -1405,6 +1447,20 @@
     </w:p>
     <w:p>
       <w:pPr>
+        <w:spacing w:after="120" w:before="0"/>
+        <w:ind w:left="560"/>
+      </w:pPr>
+      <w:r>
+        <w:rPr>
+          <w:i/>
+          <w:color w:val="2E5C8A"/>
+          <w:sz w:val="18"/>
+        </w:rPr>
+        <w:t>→ Read: agent_platform/docs/04 §3.2 — built (channel adapters normalize every source into one event shape)</w:t>
+      </w:r>
+    </w:p>
+    <w:p>
+      <w:pPr>
         <w:pStyle w:val="ListParagraph"/>
         <w:numPr>
           <w:ilvl w:val="0"/>
@@ -1422,6 +1478,20 @@
     </w:p>
     <w:p>
       <w:pPr>
+        <w:spacing w:after="120" w:before="0"/>
+        <w:ind w:left="560"/>
+      </w:pPr>
+      <w:r>
+        <w:rPr>
+          <w:i/>
+          <w:color w:val="2E5C8A"/>
+          <w:sz w:val="18"/>
+        </w:rPr>
+        <w:t>→ Read: agent_platform/docs/04 §3.2 — built (trigger/routing layer)</w:t>
+      </w:r>
+    </w:p>
+    <w:p>
+      <w:pPr>
         <w:pStyle w:val="ListParagraph"/>
         <w:numPr>
           <w:ilvl w:val="0"/>
@@ -1439,6 +1509,20 @@
     </w:p>
     <w:p>
       <w:pPr>
+        <w:spacing w:after="120" w:before="0"/>
+        <w:ind w:left="560"/>
+      </w:pPr>
+      <w:r>
+        <w:rPr>
+          <w:i/>
+          <w:color w:val="2E5C8A"/>
+          <w:sz w:val="18"/>
+        </w:rPr>
+        <w:t>→ Read: agent_platform/docs/04 §3.2 — partial: the versioned spec store is real; a visual builder is not built (out of scope)</w:t>
+      </w:r>
+    </w:p>
+    <w:p>
+      <w:pPr>
         <w:pStyle w:val="ListParagraph"/>
         <w:numPr>
           <w:ilvl w:val="0"/>
@@ -1456,6 +1540,20 @@
     </w:p>
     <w:p>
       <w:pPr>
+        <w:spacing w:after="120" w:before="0"/>
+        <w:ind w:left="560"/>
+      </w:pPr>
+      <w:r>
+        <w:rPr>
+          <w:i/>
+          <w:color w:val="2E5C8A"/>
+          <w:sz w:val="18"/>
+        </w:rPr>
+        <w:t>→ Read: agent_platform/docs/04 §3.2 — built (durable, checkpointed orchestration, crash-resume demoed)</w:t>
+      </w:r>
+    </w:p>
+    <w:p>
+      <w:pPr>
         <w:pStyle w:val="ListParagraph"/>
         <w:numPr>
           <w:ilvl w:val="0"/>
@@ -1473,6 +1571,20 @@
     </w:p>
     <w:p>
       <w:pPr>
+        <w:spacing w:after="120" w:before="0"/>
+        <w:ind w:left="560"/>
+      </w:pPr>
+      <w:r>
+        <w:rPr>
+          <w:i/>
+          <w:color w:val="2E5C8A"/>
+          <w:sz w:val="18"/>
+        </w:rPr>
+        <w:t>→ Read: agent_platform/docs/04 §3.2 — partial: the loop shape is real, but the planner is a fixed sequence, not a model choosing tools</w:t>
+      </w:r>
+    </w:p>
+    <w:p>
+      <w:pPr>
         <w:pStyle w:val="ListParagraph"/>
         <w:numPr>
           <w:ilvl w:val="0"/>
@@ -1490,6 +1602,20 @@
     </w:p>
     <w:p>
       <w:pPr>
+        <w:spacing w:after="120" w:before="0"/>
+        <w:ind w:left="560"/>
+      </w:pPr>
+      <w:r>
+        <w:rPr>
+          <w:i/>
+          <w:color w:val="2E5C8A"/>
+          <w:sz w:val="18"/>
+        </w:rPr>
+        <w:t>→ Read: agent_platform/docs/04 §3.2 — built (a typed, scoped tool catalog)</w:t>
+      </w:r>
+    </w:p>
+    <w:p>
+      <w:pPr>
         <w:pStyle w:val="ListParagraph"/>
         <w:numPr>
           <w:ilvl w:val="0"/>
@@ -1507,6 +1633,20 @@
     </w:p>
     <w:p>
       <w:pPr>
+        <w:spacing w:after="120" w:before="0"/>
+        <w:ind w:left="560"/>
+      </w:pPr>
+      <w:r>
+        <w:rPr>
+          <w:i/>
+          <w:color w:val="2E5C8A"/>
+          <w:sz w:val="18"/>
+        </w:rPr>
+        <w:t>→ Read: agent_platform/docs/04 §3.2 (not built) + cross_cutting_prep/01 §2 (secrets management mechanics)</w:t>
+      </w:r>
+    </w:p>
+    <w:p>
+      <w:pPr>
         <w:pStyle w:val="ListParagraph"/>
         <w:numPr>
           <w:ilvl w:val="0"/>
@@ -1524,6 +1664,20 @@
     </w:p>
     <w:p>
       <w:pPr>
+        <w:spacing w:after="120" w:before="0"/>
+        <w:ind w:left="560"/>
+      </w:pPr>
+      <w:r>
+        <w:rPr>
+          <w:i/>
+          <w:color w:val="2E5C8A"/>
+          <w:sz w:val="18"/>
+        </w:rPr>
+        <w:t>→ Read: agent_platform/docs/04 §3.2 — approval gates and spend caps built; PII redaction not built (a reusable pattern exists elsewhere)</w:t>
+      </w:r>
+    </w:p>
+    <w:p>
+      <w:pPr>
         <w:pStyle w:val="ListParagraph"/>
         <w:numPr>
           <w:ilvl w:val="0"/>
@@ -1537,6 +1691,20 @@
           <w:szCs w:val="21"/>
         </w:rPr>
         <w:t xml:space="preserve">Run store and trace log — every step, prompt, tool call, and output persisted for debugging and audit</w:t>
+      </w:r>
+    </w:p>
+    <w:p>
+      <w:pPr>
+        <w:spacing w:after="120" w:before="0"/>
+        <w:ind w:left="560"/>
+      </w:pPr>
+      <w:r>
+        <w:rPr>
+          <w:i/>
+          <w:color w:val="2E5C8A"/>
+          <w:sz w:val="18"/>
+        </w:rPr>
+        <w:t>→ Read: agent_platform/docs/04 §3.2 — built (a run store and trace log)</w:t>
       </w:r>
     </w:p>
     <w:p>
@@ -1574,6 +1742,20 @@
     </w:p>
     <w:p>
       <w:pPr>
+        <w:spacing w:after="120" w:before="0"/>
+        <w:ind w:left="560"/>
+      </w:pPr>
+      <w:r>
+        <w:rPr>
+          <w:i/>
+          <w:color w:val="2E5C8A"/>
+          <w:sz w:val="18"/>
+        </w:rPr>
+        <w:t>→ Read: agent_platform/docs/04 §3.3 — not built (a template library to clone from)</w:t>
+      </w:r>
+    </w:p>
+    <w:p>
+      <w:pPr>
         <w:pStyle w:val="ListParagraph"/>
         <w:numPr>
           <w:ilvl w:val="0"/>
@@ -1591,6 +1773,20 @@
     </w:p>
     <w:p>
       <w:pPr>
+        <w:spacing w:after="120" w:before="0"/>
+        <w:ind w:left="560"/>
+      </w:pPr>
+      <w:r>
+        <w:rPr>
+          <w:i/>
+          <w:color w:val="2E5C8A"/>
+          <w:sz w:val="18"/>
+        </w:rPr>
+        <w:t>→ Read: agent_platform/docs/04 §3.3 — not built, needs a real model (verbal only)</w:t>
+      </w:r>
+    </w:p>
+    <w:p>
+      <w:pPr>
         <w:pStyle w:val="ListParagraph"/>
         <w:numPr>
           <w:ilvl w:val="0"/>
@@ -1608,6 +1804,20 @@
     </w:p>
     <w:p>
       <w:pPr>
+        <w:spacing w:after="120" w:before="0"/>
+        <w:ind w:left="560"/>
+      </w:pPr>
+      <w:r>
+        <w:rPr>
+          <w:i/>
+          <w:color w:val="2E5C8A"/>
+          <w:sz w:val="18"/>
+        </w:rPr>
+        <w:t>→ Read: agent_platform/docs/04 §3.3 — built (a dry-run mode with all writes mocked)</w:t>
+      </w:r>
+    </w:p>
+    <w:p>
+      <w:pPr>
         <w:pStyle w:val="ListParagraph"/>
         <w:numPr>
           <w:ilvl w:val="0"/>
@@ -1625,6 +1835,20 @@
     </w:p>
     <w:p>
       <w:pPr>
+        <w:spacing w:after="120" w:before="0"/>
+        <w:ind w:left="560"/>
+      </w:pPr>
+      <w:r>
+        <w:rPr>
+          <w:i/>
+          <w:color w:val="2E5C8A"/>
+          <w:sz w:val="18"/>
+        </w:rPr>
+        <w:t>→ Read: agent_platform/docs/04 §3.3 — not built (low effort: summarize the existing structured trace in plain language)</w:t>
+      </w:r>
+    </w:p>
+    <w:p>
+      <w:pPr>
         <w:pStyle w:val="ListParagraph"/>
         <w:numPr>
           <w:ilvl w:val="0"/>
@@ -1638,6 +1862,20 @@
           <w:szCs w:val="21"/>
         </w:rPr>
         <w:t xml:space="preserve">Staged rollout: draft → test on sample events → shadow mode (runs but does not act) → live with human approval → fully autonomous</w:t>
+      </w:r>
+    </w:p>
+    <w:p>
+      <w:pPr>
+        <w:spacing w:after="120" w:before="0"/>
+        <w:ind w:left="560"/>
+      </w:pPr>
+      <w:r>
+        <w:rPr>
+          <w:i/>
+          <w:color w:val="2E5C8A"/>
+          <w:sz w:val="18"/>
+        </w:rPr>
+        <w:t>→ Read: agent_platform/docs/04 §3.3 — built (staged rollout through increasing autonomy)</w:t>
       </w:r>
     </w:p>
     <w:p>
@@ -1675,6 +1913,20 @@
     </w:p>
     <w:p>
       <w:pPr>
+        <w:spacing w:after="120" w:before="0"/>
+        <w:ind w:left="560"/>
+      </w:pPr>
+      <w:r>
+        <w:rPr>
+          <w:i/>
+          <w:color w:val="2E5C8A"/>
+          <w:sz w:val="18"/>
+        </w:rPr>
+        <w:t>→ Read: agent_platform/docs/01-theory.md — the project's core thesis: deterministic control flow around probabilistic reasoning</w:t>
+      </w:r>
+    </w:p>
+    <w:p>
+      <w:pPr>
         <w:pStyle w:val="ListParagraph"/>
         <w:numPr>
           <w:ilvl w:val="0"/>
@@ -1692,6 +1944,20 @@
     </w:p>
     <w:p>
       <w:pPr>
+        <w:spacing w:after="120" w:before="0"/>
+        <w:ind w:left="560"/>
+      </w:pPr>
+      <w:r>
+        <w:rPr>
+          <w:i/>
+          <w:color w:val="2E5C8A"/>
+          <w:sz w:val="18"/>
+        </w:rPr>
+        <w:t>→ Read: agent_platform/docs/03-src-modules-reference.md — argument validation before any tool call executes</w:t>
+      </w:r>
+    </w:p>
+    <w:p>
+      <w:pPr>
         <w:pStyle w:val="ListParagraph"/>
         <w:numPr>
           <w:ilvl w:val="0"/>
@@ -1709,6 +1975,20 @@
     </w:p>
     <w:p>
       <w:pPr>
+        <w:spacing w:after="120" w:before="0"/>
+        <w:ind w:left="560"/>
+      </w:pPr>
+      <w:r>
+        <w:rPr>
+          <w:i/>
+          <w:color w:val="2E5C8A"/>
+          <w:sz w:val="18"/>
+        </w:rPr>
+        <w:t>→ Read: agent_platform README (claim 2) — idempotent side effects, proven</w:t>
+      </w:r>
+    </w:p>
+    <w:p>
+      <w:pPr>
         <w:pStyle w:val="ListParagraph"/>
         <w:numPr>
           <w:ilvl w:val="0"/>
@@ -1726,6 +2006,20 @@
     </w:p>
     <w:p>
       <w:pPr>
+        <w:spacing w:after="120" w:before="0"/>
+        <w:ind w:left="560"/>
+      </w:pPr>
+      <w:r>
+        <w:rPr>
+          <w:i/>
+          <w:color w:val="2E5C8A"/>
+          <w:sz w:val="18"/>
+        </w:rPr>
+        <w:t>→ Read: agent_platform/docs/04 §3.2 — step/spend budgets that halt a run rather than let it loop</w:t>
+      </w:r>
+    </w:p>
+    <w:p>
+      <w:pPr>
         <w:pStyle w:val="ListParagraph"/>
         <w:numPr>
           <w:ilvl w:val="0"/>
@@ -1739,6 +2033,20 @@
           <w:szCs w:val="21"/>
         </w:rPr>
         <w:t xml:space="preserve">Confirmation gates on destructive actions, configurable per tenant and per tool</w:t>
+      </w:r>
+    </w:p>
+    <w:p>
+      <w:pPr>
+        <w:spacing w:after="120" w:before="0"/>
+        <w:ind w:left="560"/>
+      </w:pPr>
+      <w:r>
+        <w:rPr>
+          <w:i/>
+          <w:color w:val="2E5C8A"/>
+          <w:sz w:val="18"/>
+        </w:rPr>
+        <w:t>→ Read: agent_platform/docs/04 §3.2 — approval gates on destructive actions, built</w:t>
       </w:r>
     </w:p>
     <w:p>
@@ -1776,6 +2084,20 @@
     </w:p>
     <w:p>
       <w:pPr>
+        <w:spacing w:after="120" w:before="0"/>
+        <w:ind w:left="560"/>
+      </w:pPr>
+      <w:r>
+        <w:rPr>
+          <w:i/>
+          <w:color w:val="2E5C8A"/>
+          <w:sz w:val="18"/>
+        </w:rPr>
+        <w:t>→ Read: agent_platform/docs/04 §3.5 — built, directly demoed (crash mid-run, then resumed)</w:t>
+      </w:r>
+    </w:p>
+    <w:p>
+      <w:pPr>
         <w:pStyle w:val="ListParagraph"/>
         <w:numPr>
           <w:ilvl w:val="0"/>
@@ -1793,6 +2115,20 @@
     </w:p>
     <w:p>
       <w:pPr>
+        <w:spacing w:after="120" w:before="0"/>
+        <w:ind w:left="560"/>
+      </w:pPr>
+      <w:r>
+        <w:rPr>
+          <w:i/>
+          <w:color w:val="2E5C8A"/>
+          <w:sz w:val="18"/>
+        </w:rPr>
+        <w:t>→ Read: agent_platform/docs/04 §3.5 — built, directly demoed (priority + a lock on the shared target)</w:t>
+      </w:r>
+    </w:p>
+    <w:p>
+      <w:pPr>
         <w:pStyle w:val="ListParagraph"/>
         <w:numPr>
           <w:ilvl w:val="0"/>
@@ -1810,6 +2146,20 @@
     </w:p>
     <w:p>
       <w:pPr>
+        <w:spacing w:after="120" w:before="0"/>
+        <w:ind w:left="560"/>
+      </w:pPr>
+      <w:r>
+        <w:rPr>
+          <w:i/>
+          <w:color w:val="2E5C8A"/>
+          <w:sz w:val="18"/>
+        </w:rPr>
+        <w:t>→ Read: agent_platform/docs/04 §3.5 — partial: schema validation and scoping are real; a sandboxed review pipeline is not built</w:t>
+      </w:r>
+    </w:p>
+    <w:p>
+      <w:pPr>
         <w:pStyle w:val="ListParagraph"/>
         <w:numPr>
           <w:ilvl w:val="0"/>
@@ -1823,6 +2173,20 @@
           <w:szCs w:val="21"/>
         </w:rPr>
         <w:t xml:space="preserve">How do you version a workflow that is live? (immutable versions, pinned runs, gradual migration)</w:t>
+      </w:r>
+    </w:p>
+    <w:p>
+      <w:pPr>
+        <w:spacing w:after="120" w:before="0"/>
+        <w:ind w:left="560"/>
+      </w:pPr>
+      <w:r>
+        <w:rPr>
+          <w:i/>
+          <w:color w:val="2E5C8A"/>
+          <w:sz w:val="18"/>
+        </w:rPr>
+        <w:t>→ Read: agent_platform/docs/04 §3.5 — versioning built; gradual/canary migration between versions not built</w:t>
       </w:r>
     </w:p>
     <w:p>
@@ -1894,6 +2258,20 @@
     </w:p>
     <w:p>
       <w:pPr>
+        <w:spacing w:after="120" w:before="0"/>
+        <w:ind w:left="560"/>
+      </w:pPr>
+      <w:r>
+        <w:rPr>
+          <w:i/>
+          <w:color w:val="2E5C8A"/>
+          <w:sz w:val="18"/>
+        </w:rPr>
+        <w:t>→ Read: enterprise_rag_platform/docs/01-theory.md (the access-control section) + docs/07 §4.3</w:t>
+      </w:r>
+    </w:p>
+    <w:p>
+      <w:pPr>
         <w:pStyle w:val="ListParagraph"/>
         <w:numPr>
           <w:ilvl w:val="0"/>
@@ -1911,6 +2289,20 @@
     </w:p>
     <w:p>
       <w:pPr>
+        <w:spacing w:after="120" w:before="0"/>
+        <w:ind w:left="560"/>
+      </w:pPr>
+      <w:r>
+        <w:rPr>
+          <w:i/>
+          <w:color w:val="2E5C8A"/>
+          <w:sz w:val="18"/>
+        </w:rPr>
+        <w:t>→ Read: enterprise_rag_platform/docs/01-theory.md — 'the two-layer trick' (live revocation)</w:t>
+      </w:r>
+    </w:p>
+    <w:p>
+      <w:pPr>
         <w:pStyle w:val="ListParagraph"/>
         <w:numPr>
           <w:ilvl w:val="0"/>
@@ -1924,6 +2316,20 @@
           <w:szCs w:val="21"/>
         </w:rPr>
         <w:t xml:space="preserve">Expect the interviewer to probe: 'What happens the moment someone is removed from a Confluence space?'</w:t>
+      </w:r>
+    </w:p>
+    <w:p>
+      <w:pPr>
+        <w:spacing w:after="120" w:before="0"/>
+        <w:ind w:left="560"/>
+      </w:pPr>
+      <w:r>
+        <w:rPr>
+          <w:i/>
+          <w:color w:val="2E5C8A"/>
+          <w:sz w:val="18"/>
+        </w:rPr>
+        <w:t>→ Read: enterprise_rag_platform/docs/01-theory.md — a worked live-revocation example; docs/07 §4.6</w:t>
       </w:r>
     </w:p>
     <w:p>
@@ -1961,6 +2367,20 @@
     </w:p>
     <w:p>
       <w:pPr>
+        <w:spacing w:after="120" w:before="0"/>
+        <w:ind w:left="560"/>
+      </w:pPr>
+      <w:r>
+        <w:rPr>
+          <w:i/>
+          <w:color w:val="2E5C8A"/>
+          <w:sz w:val="18"/>
+        </w:rPr>
+        <w:t>→ Read: enterprise_rag_platform/docs/07 §4.2 — built (a second, differently-shaped source proven) + docs/08 §4 (scaling to dozens of live sources)</w:t>
+      </w:r>
+    </w:p>
+    <w:p>
+      <w:pPr>
         <w:pStyle w:val="ListParagraph"/>
         <w:numPr>
           <w:ilvl w:val="0"/>
@@ -1978,6 +2398,20 @@
     </w:p>
     <w:p>
       <w:pPr>
+        <w:spacing w:after="120" w:before="0"/>
+        <w:ind w:left="560"/>
+      </w:pPr>
+      <w:r>
+        <w:rPr>
+          <w:i/>
+          <w:color w:val="2E5C8A"/>
+          <w:sz w:val="18"/>
+        </w:rPr>
+        <w:t>→ Read: enterprise_rag_platform/docs/07 §4.2 — built (skip unchanged records via content comparison)</w:t>
+      </w:r>
+    </w:p>
+    <w:p>
+      <w:pPr>
         <w:pStyle w:val="ListParagraph"/>
         <w:numPr>
           <w:ilvl w:val="0"/>
@@ -1995,6 +2429,20 @@
     </w:p>
     <w:p>
       <w:pPr>
+        <w:spacing w:after="120" w:before="0"/>
+        <w:ind w:left="560"/>
+      </w:pPr>
+      <w:r>
+        <w:rPr>
+          <w:i/>
+          <w:color w:val="2E5C8A"/>
+          <w:sz w:val="18"/>
+        </w:rPr>
+        <w:t>→ Read: enterprise_rag_platform/docs/07 §4.2 — built (one common document schema across sources)</w:t>
+      </w:r>
+    </w:p>
+    <w:p>
+      <w:pPr>
         <w:pStyle w:val="ListParagraph"/>
         <w:numPr>
           <w:ilvl w:val="0"/>
@@ -2012,6 +2460,20 @@
     </w:p>
     <w:p>
       <w:pPr>
+        <w:spacing w:after="120" w:before="0"/>
+        <w:ind w:left="560"/>
+      </w:pPr>
+      <w:r>
+        <w:rPr>
+          <w:i/>
+          <w:color w:val="2E5C8A"/>
+          <w:sz w:val="18"/>
+        </w:rPr>
+        <w:t>→ Read: enterprise_rag_platform/docs/07 §4.2 (built, for this one format) + Scale_Optimization.md §7–8 (per-format chunking + parent-child linkage, verbal)</w:t>
+      </w:r>
+    </w:p>
+    <w:p>
+      <w:pPr>
         <w:pStyle w:val="ListParagraph"/>
         <w:numPr>
           <w:ilvl w:val="0"/>
@@ -2029,6 +2491,20 @@
     </w:p>
     <w:p>
       <w:pPr>
+        <w:spacing w:after="120" w:before="0"/>
+        <w:ind w:left="560"/>
+      </w:pPr>
+      <w:r>
+        <w:rPr>
+          <w:i/>
+          <w:color w:val="2E5C8A"/>
+          <w:sz w:val="18"/>
+        </w:rPr>
+        <w:t>→ Read: enterprise_rag_platform/docs/07 §4.2 — built (every stored chunk carries its tenant and permission metadata)</w:t>
+      </w:r>
+    </w:p>
+    <w:p>
+      <w:pPr>
         <w:pStyle w:val="ListParagraph"/>
         <w:numPr>
           <w:ilvl w:val="0"/>
@@ -2042,6 +2518,20 @@
           <w:szCs w:val="21"/>
         </w:rPr>
         <w:t xml:space="preserve">A dead-letter queue plus per-source freshness metrics — 'last successful sync' is a first-class, user-visible signal</w:t>
+      </w:r>
+    </w:p>
+    <w:p>
+      <w:pPr>
+        <w:spacing w:after="120" w:before="0"/>
+        <w:ind w:left="560"/>
+      </w:pPr>
+      <w:r>
+        <w:rPr>
+          <w:i/>
+          <w:color w:val="2E5C8A"/>
+          <w:sz w:val="18"/>
+        </w:rPr>
+        <w:t>→ Read: enterprise_rag_platform/docs/07 §4.2 — built (a rejected-records log and per-source freshness signal)</w:t>
       </w:r>
     </w:p>
     <w:p>
@@ -2079,6 +2569,20 @@
     </w:p>
     <w:p>
       <w:pPr>
+        <w:spacing w:after="120" w:before="0"/>
+        <w:ind w:left="560"/>
+      </w:pPr>
+      <w:r>
+        <w:rPr>
+          <w:i/>
+          <w:color w:val="2E5C8A"/>
+          <w:sz w:val="18"/>
+        </w:rPr>
+        <w:t>→ Read: enterprise_rag_platform/docs/01-theory.md 'the two-layer trick' (the fast, approximate layer) + docs/07 §4.3</w:t>
+      </w:r>
+    </w:p>
+    <w:p>
+      <w:pPr>
         <w:pStyle w:val="ListParagraph"/>
         <w:numPr>
           <w:ilvl w:val="0"/>
@@ -2096,6 +2600,20 @@
     </w:p>
     <w:p>
       <w:pPr>
+        <w:spacing w:after="120" w:before="0"/>
+        <w:ind w:left="560"/>
+      </w:pPr>
+      <w:r>
+        <w:rPr>
+          <w:i/>
+          <w:color w:val="2E5C8A"/>
+          <w:sz w:val="18"/>
+        </w:rPr>
+        <w:t>→ Read: enterprise_rag_platform/docs/01-theory.md — the 'top result count silently shrinks' example of why this pattern leaks</w:t>
+      </w:r>
+    </w:p>
+    <w:p>
+      <w:pPr>
         <w:pStyle w:val="ListParagraph"/>
         <w:numPr>
           <w:ilvl w:val="0"/>
@@ -2113,6 +2631,20 @@
     </w:p>
     <w:p>
       <w:pPr>
+        <w:spacing w:after="120" w:before="0"/>
+        <w:ind w:left="560"/>
+      </w:pPr>
+      <w:r>
+        <w:rPr>
+          <w:i/>
+          <w:color w:val="2E5C8A"/>
+          <w:sz w:val="18"/>
+        </w:rPr>
+        <w:t>→ Read: enterprise_rag_platform/docs/07 §4.3 — per-tenant separation built; per-group separation not built (large effort)</w:t>
+      </w:r>
+    </w:p>
+    <w:p>
+      <w:pPr>
         <w:pStyle w:val="ListParagraph"/>
         <w:numPr>
           <w:ilvl w:val="0"/>
@@ -2130,6 +2662,20 @@
     </w:p>
     <w:p>
       <w:pPr>
+        <w:spacing w:after="120" w:before="0"/>
+        <w:ind w:left="560"/>
+      </w:pPr>
+      <w:r>
+        <w:rPr>
+          <w:i/>
+          <w:color w:val="2E5C8A"/>
+          <w:sz w:val="18"/>
+        </w:rPr>
+        <w:t>→ Read: enterprise_rag_platform/docs/01-theory.md (the authoritative recheck layer) + docs/07 §4.3</w:t>
+      </w:r>
+    </w:p>
+    <w:p>
+      <w:pPr>
         <w:pStyle w:val="ListParagraph"/>
         <w:numPr>
           <w:ilvl w:val="0"/>
@@ -2147,6 +2693,20 @@
     </w:p>
     <w:p>
       <w:pPr>
+        <w:spacing w:after="120" w:before="0"/>
+        <w:ind w:left="560"/>
+      </w:pPr>
+      <w:r>
+        <w:rPr>
+          <w:i/>
+          <w:color w:val="2E5C8A"/>
+          <w:sz w:val="18"/>
+        </w:rPr>
+        <w:t>→ Read: enterprise_rag_platform/docs/01-theory.md — 'the model is never the enforcement point'</w:t>
+      </w:r>
+    </w:p>
+    <w:p>
+      <w:pPr>
         <w:pStyle w:val="ListParagraph"/>
         <w:numPr>
           <w:ilvl w:val="0"/>
@@ -2160,6 +2720,20 @@
           <w:szCs w:val="21"/>
         </w:rPr>
         <w:t xml:space="preserve">Store ACLs as group identifiers, not resolved user lists, so a group membership change takes effect without reindexing</w:t>
+      </w:r>
+    </w:p>
+    <w:p>
+      <w:pPr>
+        <w:spacing w:after="120" w:before="0"/>
+        <w:ind w:left="560"/>
+      </w:pPr>
+      <w:r>
+        <w:rPr>
+          <w:i/>
+          <w:color w:val="2E5C8A"/>
+          <w:sz w:val="18"/>
+        </w:rPr>
+        <w:t>→ Read: enterprise_rag_platform/docs/01-theory.md — live revocation + docs/07 §4.3</w:t>
       </w:r>
     </w:p>
     <w:p>
@@ -2197,6 +2771,20 @@
     </w:p>
     <w:p>
       <w:pPr>
+        <w:spacing w:after="120" w:before="0"/>
+        <w:ind w:left="560"/>
+      </w:pPr>
+      <w:r>
+        <w:rPr>
+          <w:i/>
+          <w:color w:val="2E5C8A"/>
+          <w:sz w:val="18"/>
+        </w:rPr>
+        <w:t>→ Read: enterprise_rag_platform/docs/07 §4.4 — built (meaning-based search plus keyword search, combined)</w:t>
+      </w:r>
+    </w:p>
+    <w:p>
+      <w:pPr>
         <w:pStyle w:val="ListParagraph"/>
         <w:numPr>
           <w:ilvl w:val="0"/>
@@ -2214,6 +2802,20 @@
     </w:p>
     <w:p>
       <w:pPr>
+        <w:spacing w:after="120" w:before="0"/>
+        <w:ind w:left="560"/>
+      </w:pPr>
+      <w:r>
+        <w:rPr>
+          <w:i/>
+          <w:color w:val="2E5C8A"/>
+          <w:sz w:val="18"/>
+        </w:rPr>
+        <w:t>→ Read: enterprise_rag_platform/docs/07 §4.4 — built; re-ranking depth is a tunable setting, not a design gap</w:t>
+      </w:r>
+    </w:p>
+    <w:p>
+      <w:pPr>
         <w:pStyle w:val="ListParagraph"/>
         <w:numPr>
           <w:ilvl w:val="0"/>
@@ -2231,6 +2833,20 @@
     </w:p>
     <w:p>
       <w:pPr>
+        <w:spacing w:after="120" w:before="0"/>
+        <w:ind w:left="560"/>
+      </w:pPr>
+      <w:r>
+        <w:rPr>
+          <w:i/>
+          <w:color w:val="2E5C8A"/>
+          <w:sz w:val="18"/>
+        </w:rPr>
+        <w:t>→ Read: enterprise_rag_platform/docs/07 §4.4 — built (question rewriting, decomposition, and history-aware rewriting)</w:t>
+      </w:r>
+    </w:p>
+    <w:p>
+      <w:pPr>
         <w:pStyle w:val="ListParagraph"/>
         <w:numPr>
           <w:ilvl w:val="0"/>
@@ -2248,6 +2864,20 @@
     </w:p>
     <w:p>
       <w:pPr>
+        <w:spacing w:after="120" w:before="0"/>
+        <w:ind w:left="560"/>
+      </w:pPr>
+      <w:r>
+        <w:rPr>
+          <w:i/>
+          <w:color w:val="2E5C8A"/>
+          <w:sz w:val="18"/>
+        </w:rPr>
+        <w:t>→ Read: enterprise_rag_platform/docs/07 §4.4 — built (non-permission filters as a first-class option)</w:t>
+      </w:r>
+    </w:p>
+    <w:p>
+      <w:pPr>
         <w:pStyle w:val="ListParagraph"/>
         <w:numPr>
           <w:ilvl w:val="0"/>
@@ -2261,6 +2891,20 @@
           <w:szCs w:val="21"/>
         </w:rPr>
         <w:t xml:space="preserve">Answer with citations always, and prefer 'I do not have enough information' over a fluent guess</w:t>
+      </w:r>
+    </w:p>
+    <w:p>
+      <w:pPr>
+        <w:spacing w:after="120" w:before="0"/>
+        <w:ind w:left="560"/>
+      </w:pPr>
+      <w:r>
+        <w:rPr>
+          <w:i/>
+          <w:color w:val="2E5C8A"/>
+          <w:sz w:val="18"/>
+        </w:rPr>
+        <w:t>→ Read: enterprise_rag_platform/docs/01-theory.md §8 (guardrails on the way out) + docs/07 §4.4</w:t>
       </w:r>
     </w:p>
     <w:p>
@@ -2298,6 +2942,20 @@
     </w:p>
     <w:p>
       <w:pPr>
+        <w:spacing w:after="120" w:before="0"/>
+        <w:ind w:left="560"/>
+      </w:pPr>
+      <w:r>
+        <w:rPr>
+          <w:i/>
+          <w:color w:val="2E5C8A"/>
+          <w:sz w:val="18"/>
+        </w:rPr>
+        <w:t>→ Read: enterprise_rag_platform/docs/01-theory.md §9 — retrieval and generation metrics kept separate</w:t>
+      </w:r>
+    </w:p>
+    <w:p>
+      <w:pPr>
         <w:pStyle w:val="ListParagraph"/>
         <w:numPr>
           <w:ilvl w:val="0"/>
@@ -2315,6 +2973,20 @@
     </w:p>
     <w:p>
       <w:pPr>
+        <w:spacing w:after="120" w:before="0"/>
+        <w:ind w:left="560"/>
+      </w:pPr>
+      <w:r>
+        <w:rPr>
+          <w:i/>
+          <w:color w:val="2E5C8A"/>
+          <w:sz w:val="18"/>
+        </w:rPr>
+        <w:t>→ Read: enterprise_rag_platform/docs/07 §4.5 — partial: the mechanism is real, only a small synthetic set exists, not the full target size</w:t>
+      </w:r>
+    </w:p>
+    <w:p>
+      <w:pPr>
         <w:pStyle w:val="ListParagraph"/>
         <w:numPr>
           <w:ilvl w:val="0"/>
@@ -2332,6 +3004,20 @@
     </w:p>
     <w:p>
       <w:pPr>
+        <w:spacing w:after="120" w:before="0"/>
+        <w:ind w:left="560"/>
+      </w:pPr>
+      <w:r>
+        <w:rPr>
+          <w:i/>
+          <w:color w:val="2E5C8A"/>
+          <w:sz w:val="18"/>
+        </w:rPr>
+        <w:t>→ Read: enterprise_rag_platform/docs/07 §4.5 — built (a permission-specific test suite as a hard release gate)</w:t>
+      </w:r>
+    </w:p>
+    <w:p>
+      <w:pPr>
         <w:pStyle w:val="ListParagraph"/>
         <w:numPr>
           <w:ilvl w:val="0"/>
@@ -2349,6 +3035,20 @@
     </w:p>
     <w:p>
       <w:pPr>
+        <w:spacing w:after="120" w:before="0"/>
+        <w:ind w:left="560"/>
+      </w:pPr>
+      <w:r>
+        <w:rPr>
+          <w:i/>
+          <w:color w:val="2E5C8A"/>
+          <w:sz w:val="18"/>
+        </w:rPr>
+        <w:t>→ Read: enterprise_rag_platform/docs/07 §4.5 — built (a model-as-judge calibrated against human labels)</w:t>
+      </w:r>
+    </w:p>
+    <w:p>
+      <w:pPr>
         <w:pStyle w:val="ListParagraph"/>
         <w:numPr>
           <w:ilvl w:val="0"/>
@@ -2362,6 +3062,20 @@
           <w:szCs w:val="21"/>
         </w:rPr>
         <w:t xml:space="preserve">Online signals: thumbs up/down, citation click-through, escalation-to-human rate, and unanswered-query clustering to find content gaps</w:t>
+      </w:r>
+    </w:p>
+    <w:p>
+      <w:pPr>
+        <w:spacing w:after="120" w:before="0"/>
+        <w:ind w:left="560"/>
+      </w:pPr>
+      <w:r>
+        <w:rPr>
+          <w:i/>
+          <w:color w:val="2E5C8A"/>
+          <w:sz w:val="18"/>
+        </w:rPr>
+        <w:t>→ Read: enterprise_rag_platform/docs/07 §4.5 — not built (verbal only) + docs/10 §3 (escalation outcomes as the missing feedback signal)</w:t>
       </w:r>
     </w:p>
     <w:p>
@@ -2399,6 +3113,20 @@
     </w:p>
     <w:p>
       <w:pPr>
+        <w:spacing w:after="120" w:before="0"/>
+        <w:ind w:left="560"/>
+      </w:pPr>
+      <w:r>
+        <w:rPr>
+          <w:i/>
+          <w:color w:val="2E5C8A"/>
+          <w:sz w:val="18"/>
+        </w:rPr>
+        <w:t>→ Read: enterprise_rag_platform/docs/07 §4.6 — built, directly demoed (a permission change takes effect with no reindex)</w:t>
+      </w:r>
+    </w:p>
+    <w:p>
+      <w:pPr>
         <w:pStyle w:val="ListParagraph"/>
         <w:numPr>
           <w:ilvl w:val="0"/>
@@ -2416,6 +3144,20 @@
     </w:p>
     <w:p>
       <w:pPr>
+        <w:spacing w:after="120" w:before="0"/>
+        <w:ind w:left="560"/>
+      </w:pPr>
+      <w:r>
+        <w:rPr>
+          <w:i/>
+          <w:color w:val="2E5C8A"/>
+          <w:sz w:val="18"/>
+        </w:rPr>
+        <w:t>→ Read: enterprise_rag_platform/docs/07 §4.6 — built (an explicit refusal path, never a silent empty answer)</w:t>
+      </w:r>
+    </w:p>
+    <w:p>
+      <w:pPr>
         <w:pStyle w:val="ListParagraph"/>
         <w:numPr>
           <w:ilvl w:val="0"/>
@@ -2433,6 +3175,20 @@
     </w:p>
     <w:p>
       <w:pPr>
+        <w:spacing w:after="120" w:before="0"/>
+        <w:ind w:left="560"/>
+      </w:pPr>
+      <w:r>
+        <w:rPr>
+          <w:i/>
+          <w:color w:val="2E5C8A"/>
+          <w:sz w:val="18"/>
+        </w:rPr>
+        <w:t>→ Read: enterprise_rag_platform/Scale_Optimization.md — the whole document</w:t>
+      </w:r>
+    </w:p>
+    <w:p>
+      <w:pPr>
         <w:pStyle w:val="ListParagraph"/>
         <w:numPr>
           <w:ilvl w:val="0"/>
@@ -2446,6 +3202,20 @@
           <w:szCs w:val="21"/>
         </w:rPr>
         <w:t xml:space="preserve">The same fact appears in three sources with different answers — which wins? (source authority ranking and recency, surfaced as a conflict)</w:t>
+      </w:r>
+    </w:p>
+    <w:p>
+      <w:pPr>
+        <w:spacing w:after="120" w:before="0"/>
+        <w:ind w:left="560"/>
+      </w:pPr>
+      <w:r>
+        <w:rPr>
+          <w:i/>
+          <w:color w:val="2E5C8A"/>
+          <w:sz w:val="18"/>
+        </w:rPr>
+        <w:t>→ Read: enterprise_rag_platform/Scale_Optimization.md — conflicting sources resolved by a source-authority ranking</w:t>
       </w:r>
     </w:p>
     <w:p>
@@ -2517,6 +3287,20 @@
     </w:p>
     <w:p>
       <w:pPr>
+        <w:spacing w:after="120" w:before="0"/>
+        <w:ind w:left="560"/>
+      </w:pPr>
+      <w:r>
+        <w:rPr>
+          <w:i/>
+          <w:color w:val="2E5C8A"/>
+          <w:sz w:val="18"/>
+        </w:rPr>
+        <w:t>→ Read: delivery_framework_platform/docs/04 §5.1</w:t>
+      </w:r>
+    </w:p>
+    <w:p>
+      <w:pPr>
         <w:pStyle w:val="ListParagraph"/>
         <w:numPr>
           <w:ilvl w:val="0"/>
@@ -2534,6 +3318,20 @@
     </w:p>
     <w:p>
       <w:pPr>
+        <w:spacing w:after="120" w:before="0"/>
+        <w:ind w:left="560"/>
+      </w:pPr>
+      <w:r>
+        <w:rPr>
+          <w:i/>
+          <w:color w:val="2E5C8A"/>
+          <w:sz w:val="18"/>
+        </w:rPr>
+        <w:t>→ Read: delivery_framework_platform/docs/04 §5.1 — a reusable-asset library with a measured reuse rate</w:t>
+      </w:r>
+    </w:p>
+    <w:p>
+      <w:pPr>
         <w:pStyle w:val="ListParagraph"/>
         <w:numPr>
           <w:ilvl w:val="0"/>
@@ -2547,6 +3345,20 @@
           <w:szCs w:val="21"/>
         </w:rPr>
         <w:t xml:space="preserve">Answer it as a system with inputs, stages, artefacts, gates, and metrics, and draw it as a pipeline on the board</w:t>
+      </w:r>
+    </w:p>
+    <w:p>
+      <w:pPr>
+        <w:spacing w:after="120" w:before="0"/>
+        <w:ind w:left="560"/>
+      </w:pPr>
+      <w:r>
+        <w:rPr>
+          <w:i/>
+          <w:color w:val="2E5C8A"/>
+          <w:sz w:val="18"/>
+        </w:rPr>
+        <w:t>→ Read: delivery_framework_platform/docs/02-architecture-end-to-end.md §2 (the pipeline diagram)</w:t>
       </w:r>
     </w:p>
     <w:p>
@@ -2584,6 +3396,20 @@
     </w:p>
     <w:p>
       <w:pPr>
+        <w:spacing w:after="120" w:before="0"/>
+        <w:ind w:left="560"/>
+      </w:pPr>
+      <w:r>
+        <w:rPr>
+          <w:i/>
+          <w:color w:val="2E5C8A"/>
+          <w:sz w:val="18"/>
+        </w:rPr>
+        <w:t>→ Read: delivery_framework_platform/docs/04 §5.2 — the seven stages, in order</w:t>
+      </w:r>
+    </w:p>
+    <w:p>
+      <w:pPr>
         <w:pStyle w:val="ListParagraph"/>
         <w:numPr>
           <w:ilvl w:val="0"/>
@@ -2601,6 +3427,20 @@
     </w:p>
     <w:p>
       <w:pPr>
+        <w:spacing w:after="120" w:before="0"/>
+        <w:ind w:left="560"/>
+      </w:pPr>
+      <w:r>
+        <w:rPr>
+          <w:i/>
+          <w:color w:val="2E5C8A"/>
+          <w:sz w:val="18"/>
+        </w:rPr>
+        <w:t>→ Read: delivery_framework_platform/docs/04 §5.2 — built; the order is structurally enforced, not just documented</w:t>
+      </w:r>
+    </w:p>
+    <w:p>
+      <w:pPr>
         <w:pStyle w:val="ListParagraph"/>
         <w:numPr>
           <w:ilvl w:val="0"/>
@@ -2618,6 +3458,20 @@
     </w:p>
     <w:p>
       <w:pPr>
+        <w:spacing w:after="120" w:before="0"/>
+        <w:ind w:left="560"/>
+      </w:pPr>
+      <w:r>
+        <w:rPr>
+          <w:i/>
+          <w:color w:val="2E5C8A"/>
+          <w:sz w:val="18"/>
+        </w:rPr>
+        <w:t>→ Read: delivery_framework_platform/docs/04 §5.2</w:t>
+      </w:r>
+    </w:p>
+    <w:p>
+      <w:pPr>
         <w:pStyle w:val="ListParagraph"/>
         <w:numPr>
           <w:ilvl w:val="0"/>
@@ -2635,6 +3489,20 @@
     </w:p>
     <w:p>
       <w:pPr>
+        <w:spacing w:after="120" w:before="0"/>
+        <w:ind w:left="560"/>
+      </w:pPr>
+      <w:r>
+        <w:rPr>
+          <w:i/>
+          <w:color w:val="2E5C8A"/>
+          <w:sz w:val="18"/>
+        </w:rPr>
+        <w:t>→ Read: delivery_framework_platform/docs/04 §5.2</w:t>
+      </w:r>
+    </w:p>
+    <w:p>
+      <w:pPr>
         <w:pStyle w:val="ListParagraph"/>
         <w:numPr>
           <w:ilvl w:val="0"/>
@@ -2652,6 +3520,20 @@
     </w:p>
     <w:p>
       <w:pPr>
+        <w:spacing w:after="120" w:before="0"/>
+        <w:ind w:left="560"/>
+      </w:pPr>
+      <w:r>
+        <w:rPr>
+          <w:i/>
+          <w:color w:val="2E5C8A"/>
+          <w:sz w:val="18"/>
+        </w:rPr>
+        <w:t>→ Read: delivery_framework_platform/docs/04 §5.2</w:t>
+      </w:r>
+    </w:p>
+    <w:p>
+      <w:pPr>
         <w:pStyle w:val="ListParagraph"/>
         <w:numPr>
           <w:ilvl w:val="0"/>
@@ -2669,6 +3551,20 @@
     </w:p>
     <w:p>
       <w:pPr>
+        <w:spacing w:after="120" w:before="0"/>
+        <w:ind w:left="560"/>
+      </w:pPr>
+      <w:r>
+        <w:rPr>
+          <w:i/>
+          <w:color w:val="2E5C8A"/>
+          <w:sz w:val="18"/>
+        </w:rPr>
+        <w:t>→ Read: delivery_framework_platform/docs/04 §5.2</w:t>
+      </w:r>
+    </w:p>
+    <w:p>
+      <w:pPr>
         <w:pStyle w:val="ListParagraph"/>
         <w:numPr>
           <w:ilvl w:val="0"/>
@@ -2682,6 +3578,20 @@
           <w:szCs w:val="21"/>
         </w:rPr>
         <w:t xml:space="preserve">Day 14 — Go/no-go against the agreed success metrics, then handover: runbook, dashboards, escalation path, and owner</w:t>
+      </w:r>
+    </w:p>
+    <w:p>
+      <w:pPr>
+        <w:spacing w:after="120" w:before="0"/>
+        <w:ind w:left="560"/>
+      </w:pPr>
+      <w:r>
+        <w:rPr>
+          <w:i/>
+          <w:color w:val="2E5C8A"/>
+          <w:sz w:val="18"/>
+        </w:rPr>
+        <w:t>→ Read: delivery_framework_platform/docs/04 §5.2</w:t>
       </w:r>
     </w:p>
     <w:p>
@@ -2719,6 +3629,20 @@
     </w:p>
     <w:p>
       <w:pPr>
+        <w:spacing w:after="120" w:before="0"/>
+        <w:ind w:left="560"/>
+      </w:pPr>
+      <w:r>
+        <w:rPr>
+          <w:i/>
+          <w:color w:val="2E5C8A"/>
+          <w:sz w:val="18"/>
+        </w:rPr>
+        <w:t>→ Read: delivery_framework_platform/docs/04 §5.3 — built (a reusable asset library covering all five kinds)</w:t>
+      </w:r>
+    </w:p>
+    <w:p>
+      <w:pPr>
         <w:pStyle w:val="ListParagraph"/>
         <w:numPr>
           <w:ilvl w:val="0"/>
@@ -2736,6 +3660,20 @@
     </w:p>
     <w:p>
       <w:pPr>
+        <w:spacing w:after="120" w:before="0"/>
+        <w:ind w:left="560"/>
+      </w:pPr>
+      <w:r>
+        <w:rPr>
+          <w:i/>
+          <w:color w:val="2E5C8A"/>
+          <w:sz w:val="18"/>
+        </w:rPr>
+        <w:t>→ Read: delivery_framework_platform/docs/04 §5.3 — built (intake refuses to start on missing prerequisites)</w:t>
+      </w:r>
+    </w:p>
+    <w:p>
+      <w:pPr>
         <w:pStyle w:val="ListParagraph"/>
         <w:numPr>
           <w:ilvl w:val="0"/>
@@ -2753,6 +3691,20 @@
     </w:p>
     <w:p>
       <w:pPr>
+        <w:spacing w:after="120" w:before="0"/>
+        <w:ind w:left="560"/>
+      </w:pPr>
+      <w:r>
+        <w:rPr>
+          <w:i/>
+          <w:color w:val="2E5C8A"/>
+          <w:sz w:val="18"/>
+        </w:rPr>
+        <w:t>→ Read: delivery_framework_platform/docs/04 §5.3 — not built (moderate effort: parameterized per-customer config)</w:t>
+      </w:r>
+    </w:p>
+    <w:p>
+      <w:pPr>
         <w:pStyle w:val="ListParagraph"/>
         <w:numPr>
           <w:ilvl w:val="0"/>
@@ -2770,6 +3722,20 @@
     </w:p>
     <w:p>
       <w:pPr>
+        <w:spacing w:after="120" w:before="0"/>
+        <w:ind w:left="560"/>
+      </w:pPr>
+      <w:r>
+        <w:rPr>
+          <w:i/>
+          <w:color w:val="2E5C8A"/>
+          <w:sz w:val="18"/>
+        </w:rPr>
+        <w:t>→ Read: delivery_framework_platform/docs/04 §5.3 — partial: the harness is named as a reusable asset; the demo score is a placeholder, not computed</w:t>
+      </w:r>
+    </w:p>
+    <w:p>
+      <w:pPr>
         <w:pStyle w:val="ListParagraph"/>
         <w:numPr>
           <w:ilvl w:val="0"/>
@@ -2783,6 +3749,20 @@
           <w:szCs w:val="21"/>
         </w:rPr>
         <w:t xml:space="preserve">A definition of done that includes observability and a runbook, so support does not become the architect's second job</w:t>
+      </w:r>
+    </w:p>
+    <w:p>
+      <w:pPr>
+        <w:spacing w:after="120" w:before="0"/>
+        <w:ind w:left="560"/>
+      </w:pPr>
+      <w:r>
+        <w:rPr>
+          <w:i/>
+          <w:color w:val="2E5C8A"/>
+          <w:sz w:val="18"/>
+        </w:rPr>
+        <w:t>→ Read: delivery_framework_platform/docs/04 §5.3 — built (observability and a runbook as part of done)</w:t>
       </w:r>
     </w:p>
     <w:p>
@@ -2820,6 +3800,20 @@
     </w:p>
     <w:p>
       <w:pPr>
+        <w:spacing w:after="120" w:before="0"/>
+        <w:ind w:left="560"/>
+      </w:pPr>
+      <w:r>
+        <w:rPr>
+          <w:i/>
+          <w:color w:val="2E5C8A"/>
+          <w:sz w:val="18"/>
+        </w:rPr>
+        <w:t>→ Read: delivery_framework_platform (the gate definitions, built) + docs/05 §1 (the evidence-bar depth gap)</w:t>
+      </w:r>
+    </w:p>
+    <w:p>
+      <w:pPr>
         <w:pStyle w:val="ListParagraph"/>
         <w:numPr>
           <w:ilvl w:val="0"/>
@@ -2837,6 +3831,20 @@
     </w:p>
     <w:p>
       <w:pPr>
+        <w:spacing w:after="120" w:before="0"/>
+        <w:ind w:left="560"/>
+      </w:pPr>
+      <w:r>
+        <w:rPr>
+          <w:i/>
+          <w:color w:val="2E5C8A"/>
+          <w:sz w:val="18"/>
+        </w:rPr>
+        <w:t>→ Read: delivery_framework_platform/docs/04 §5.4 — most mitigations built; change-control on scope creep not built (low effort)</w:t>
+      </w:r>
+    </w:p>
+    <w:p>
+      <w:pPr>
         <w:pStyle w:val="ListParagraph"/>
         <w:numPr>
           <w:ilvl w:val="0"/>
@@ -2854,6 +3862,20 @@
     </w:p>
     <w:p>
       <w:pPr>
+        <w:spacing w:after="120" w:before="0"/>
+        <w:ind w:left="560"/>
+      </w:pPr>
+      <w:r>
+        <w:rPr>
+          <w:i/>
+          <w:color w:val="2E5C8A"/>
+          <w:sz w:val="18"/>
+        </w:rPr>
+        <w:t>→ Read: delivery_framework_platform — built (all four tracked metrics)</w:t>
+      </w:r>
+    </w:p>
+    <w:p>
+      <w:pPr>
         <w:pStyle w:val="ListParagraph"/>
         <w:numPr>
           <w:ilvl w:val="0"/>
@@ -2867,6 +3889,20 @@
           <w:szCs w:val="21"/>
         </w:rPr>
         <w:t xml:space="preserve">State the honest limit: some engagements should not be two weeks, and knowing which ones to reject is part of the framework</w:t>
+      </w:r>
+    </w:p>
+    <w:p>
+      <w:pPr>
+        <w:spacing w:after="120" w:before="0"/>
+        <w:ind w:left="560"/>
+      </w:pPr>
+      <w:r>
+        <w:rPr>
+          <w:i/>
+          <w:color w:val="2E5C8A"/>
+          <w:sz w:val="18"/>
+        </w:rPr>
+        <w:t>→ Read: delivery_framework_platform/docs/04 §5.4 — built (intake refuses unconditionally, not just in theory)</w:t>
       </w:r>
     </w:p>
     <w:p>
@@ -2938,6 +3974,20 @@
     </w:p>
     <w:p>
       <w:pPr>
+        <w:spacing w:after="120" w:before="0"/>
+        <w:ind w:left="560"/>
+      </w:pPr>
+      <w:r>
+        <w:rPr>
+          <w:i/>
+          <w:color w:val="2E5C8A"/>
+          <w:sz w:val="18"/>
+        </w:rPr>
+        <w:t>→ Read: enterprise_rag_platform/Scale_Optimization.md (physical separation per tenant) + agent_platform/docs/05 §3 (the isolation-architecture gap, named)</w:t>
+      </w:r>
+    </w:p>
+    <w:p>
+      <w:pPr>
         <w:pStyle w:val="ListParagraph"/>
         <w:numPr>
           <w:ilvl w:val="0"/>
@@ -2955,6 +4005,20 @@
     </w:p>
     <w:p>
       <w:pPr>
+        <w:spacing w:after="120" w:before="0"/>
+        <w:ind w:left="560"/>
+      </w:pPr>
+      <w:r>
+        <w:rPr>
+          <w:i/>
+          <w:color w:val="2E5C8A"/>
+          <w:sz w:val="18"/>
+        </w:rPr>
+        <w:t>→ Read: agent_platform/docs/05 §3 — named gap: the filter lives in application code, not the data layer</w:t>
+      </w:r>
+    </w:p>
+    <w:p>
+      <w:pPr>
         <w:pStyle w:val="ListParagraph"/>
         <w:numPr>
           <w:ilvl w:val="0"/>
@@ -2972,6 +4036,20 @@
     </w:p>
     <w:p>
       <w:pPr>
+        <w:spacing w:after="120" w:before="0"/>
+        <w:ind w:left="560"/>
+      </w:pPr>
+      <w:r>
+        <w:rPr>
+          <w:i/>
+          <w:color w:val="2E5C8A"/>
+          <w:sz w:val="18"/>
+        </w:rPr>
+        <w:t>→ Read: enterprise_rag_platform/docs/01-theory.md 'groups overlap' section — built (one separate index per tenant)</w:t>
+      </w:r>
+    </w:p>
+    <w:p>
+      <w:pPr>
         <w:pStyle w:val="ListParagraph"/>
         <w:numPr>
           <w:ilvl w:val="0"/>
@@ -2989,6 +4067,20 @@
     </w:p>
     <w:p>
       <w:pPr>
+        <w:spacing w:after="120" w:before="0"/>
+        <w:ind w:left="560"/>
+      </w:pPr>
+      <w:r>
+        <w:rPr>
+          <w:i/>
+          <w:color w:val="2E5C8A"/>
+          <w:sz w:val="18"/>
+        </w:rPr>
+        <w:t>→ Read: enterprise_rag_platform (a per-tenant rate-limit ceiling, built) + cross_cutting_prep/01 §4 (queue fairness, not built anywhere)</w:t>
+      </w:r>
+    </w:p>
+    <w:p>
+      <w:pPr>
         <w:pStyle w:val="ListParagraph"/>
         <w:numPr>
           <w:ilvl w:val="0"/>
@@ -3002,6 +4094,20 @@
           <w:szCs w:val="21"/>
         </w:rPr>
         <w:t xml:space="preserve">Per-tenant encryption keys and data residency for enterprise and regulated deals</w:t>
+      </w:r>
+    </w:p>
+    <w:p>
+      <w:pPr>
+        <w:spacing w:after="120" w:before="0"/>
+        <w:ind w:left="560"/>
+      </w:pPr>
+      <w:r>
+        <w:rPr>
+          <w:i/>
+          <w:color w:val="2E5C8A"/>
+          <w:sz w:val="18"/>
+        </w:rPr>
+        <w:t>→ Read: cross_cutting_prep/01 §3 — not built anywhere; the mechanism is explained but not implemented</w:t>
       </w:r>
     </w:p>
     <w:p>
@@ -3039,6 +4145,20 @@
     </w:p>
     <w:p>
       <w:pPr>
+        <w:spacing w:after="120" w:before="0"/>
+        <w:ind w:left="560"/>
+      </w:pPr>
+      <w:r>
+        <w:rPr>
+          <w:i/>
+          <w:color w:val="2E5C8A"/>
+          <w:sz w:val="18"/>
+        </w:rPr>
+        <w:t>→ Read: cross_cutting_prep/01 §1 — not built anywhere; every project uses a local identity lookup, not a real login provider</w:t>
+      </w:r>
+    </w:p>
+    <w:p>
+      <w:pPr>
         <w:pStyle w:val="ListParagraph"/>
         <w:numPr>
           <w:ilvl w:val="0"/>
@@ -3056,6 +4176,20 @@
     </w:p>
     <w:p>
       <w:pPr>
+        <w:spacing w:after="120" w:before="0"/>
+        <w:ind w:left="560"/>
+      </w:pPr>
+      <w:r>
+        <w:rPr>
+          <w:i/>
+          <w:color w:val="2E5C8A"/>
+          <w:sz w:val="18"/>
+        </w:rPr>
+        <w:t>→ Read: enterprise_rag_platform/docs/01-theory.md 'the model is never the enforcement point' (the retrieval side, built) + agent_platform/docs/05 §1 (the tool-calling side, not defended)</w:t>
+      </w:r>
+    </w:p>
+    <w:p>
+      <w:pPr>
         <w:pStyle w:val="ListParagraph"/>
         <w:numPr>
           <w:ilvl w:val="0"/>
@@ -3073,6 +4207,20 @@
     </w:p>
     <w:p>
       <w:pPr>
+        <w:spacing w:after="120" w:before="0"/>
+        <w:ind w:left="560"/>
+      </w:pPr>
+      <w:r>
+        <w:rPr>
+          <w:i/>
+          <w:color w:val="2E5C8A"/>
+          <w:sz w:val="18"/>
+        </w:rPr>
+        <w:t>→ Read: cross_cutting_prep/01 §2 (secrets management mechanics, not built) + agent_platform/docs/04 §3.2 (the connector/credentials layer, not built)</w:t>
+      </w:r>
+    </w:p>
+    <w:p>
+      <w:pPr>
         <w:pStyle w:val="ListParagraph"/>
         <w:numPr>
           <w:ilvl w:val="0"/>
@@ -3090,6 +4238,20 @@
     </w:p>
     <w:p>
       <w:pPr>
+        <w:spacing w:after="120" w:before="0"/>
+        <w:ind w:left="560"/>
+      </w:pPr>
+      <w:r>
+        <w:rPr>
+          <w:i/>
+          <w:color w:val="2E5C8A"/>
+          <w:sz w:val="18"/>
+        </w:rPr>
+        <w:t>→ Read: enterprise_rag_platform (a redaction step, built) + agent_platform/docs/04 §3.2 (not built there, a reusable pattern exists)</w:t>
+      </w:r>
+    </w:p>
+    <w:p>
+      <w:pPr>
         <w:pStyle w:val="ListParagraph"/>
         <w:numPr>
           <w:ilvl w:val="0"/>
@@ -3107,6 +4269,20 @@
     </w:p>
     <w:p>
       <w:pPr>
+        <w:spacing w:after="120" w:before="0"/>
+        <w:ind w:left="560"/>
+      </w:pPr>
+      <w:r>
+        <w:rPr>
+          <w:i/>
+          <w:color w:val="2E5C8A"/>
+          <w:sz w:val="18"/>
+        </w:rPr>
+        <w:t>→ Read: enterprise_rag_platform and agent_platform — both built (a full run trace and audit log)</w:t>
+      </w:r>
+    </w:p>
+    <w:p>
+      <w:pPr>
         <w:pStyle w:val="ListParagraph"/>
         <w:numPr>
           <w:ilvl w:val="0"/>
@@ -3120,6 +4296,20 @@
           <w:szCs w:val="21"/>
         </w:rPr>
         <w:t xml:space="preserve">Egress control on tools — an allow-list of destinations stops data exfiltration through a compromised tool call</w:t>
+      </w:r>
+    </w:p>
+    <w:p>
+      <w:pPr>
+        <w:spacing w:after="120" w:before="0"/>
+        <w:ind w:left="560"/>
+      </w:pPr>
+      <w:r>
+        <w:rPr>
+          <w:i/>
+          <w:color w:val="2E5C8A"/>
+          <w:sz w:val="18"/>
+        </w:rPr>
+        <w:t>→ Read: agent_platform/docs/05 §2 — named gap, distinct from the existing destructive-action allow-list</w:t>
       </w:r>
     </w:p>
     <w:p>
@@ -3157,6 +4347,20 @@
     </w:p>
     <w:p>
       <w:pPr>
+        <w:spacing w:after="120" w:before="0"/>
+        <w:ind w:left="560"/>
+      </w:pPr>
+      <w:r>
+        <w:rPr>
+          <w:i/>
+          <w:color w:val="2E5C8A"/>
+          <w:sz w:val="18"/>
+        </w:rPr>
+        <w:t>→ Read: enterprise_rag_platform and agent_platform traces (built, mostly) + cross_cutting_prep/02 §1 (a prompt-version field specifically, not built)</w:t>
+      </w:r>
+    </w:p>
+    <w:p>
+      <w:pPr>
         <w:pStyle w:val="ListParagraph"/>
         <w:numPr>
           <w:ilvl w:val="0"/>
@@ -3174,6 +4378,20 @@
     </w:p>
     <w:p>
       <w:pPr>
+        <w:spacing w:after="120" w:before="0"/>
+        <w:ind w:left="560"/>
+      </w:pPr>
+      <w:r>
+        <w:rPr>
+          <w:i/>
+          <w:color w:val="2E5C8A"/>
+          <w:sz w:val="18"/>
+        </w:rPr>
+        <w:t>→ Read: cross_cutting_prep/02 §1 — not used anywhere; every trace is a custom format, not a shared standard</w:t>
+      </w:r>
+    </w:p>
+    <w:p>
+      <w:pPr>
         <w:pStyle w:val="ListParagraph"/>
         <w:numPr>
           <w:ilvl w:val="0"/>
@@ -3191,6 +4409,20 @@
     </w:p>
     <w:p>
       <w:pPr>
+        <w:spacing w:after="120" w:before="0"/>
+        <w:ind w:left="560"/>
+      </w:pPr>
+      <w:r>
+        <w:rPr>
+          <w:i/>
+          <w:color w:val="2E5C8A"/>
+          <w:sz w:val="18"/>
+        </w:rPr>
+        <w:t>→ Read: enterprise_rag_platform — built (an evaluation harness with quality metrics)</w:t>
+      </w:r>
+    </w:p>
+    <w:p>
+      <w:pPr>
         <w:pStyle w:val="ListParagraph"/>
         <w:numPr>
           <w:ilvl w:val="0"/>
@@ -3208,6 +4440,20 @@
     </w:p>
     <w:p>
       <w:pPr>
+        <w:spacing w:after="120" w:before="0"/>
+        <w:ind w:left="560"/>
+      </w:pPr>
+      <w:r>
+        <w:rPr>
+          <w:i/>
+          <w:color w:val="2E5C8A"/>
+          <w:sz w:val="18"/>
+        </w:rPr>
+        <w:t>→ Read: agent_platform/docs/05 §4 — named gap (drift alerting)</w:t>
+      </w:r>
+    </w:p>
+    <w:p>
+      <w:pPr>
         <w:pStyle w:val="ListParagraph"/>
         <w:numPr>
           <w:ilvl w:val="0"/>
@@ -3225,6 +4471,20 @@
     </w:p>
     <w:p>
       <w:pPr>
+        <w:spacing w:after="120" w:before="0"/>
+        <w:ind w:left="560"/>
+      </w:pPr>
+      <w:r>
+        <w:rPr>
+          <w:i/>
+          <w:color w:val="2E5C8A"/>
+          <w:sz w:val="18"/>
+        </w:rPr>
+        <w:t>→ Read: cross_cutting_prep/02 §2 — never even flagged as a gap before this doc</w:t>
+      </w:r>
+    </w:p>
+    <w:p>
+      <w:pPr>
         <w:pStyle w:val="ListParagraph"/>
         <w:numPr>
           <w:ilvl w:val="0"/>
@@ -3238,6 +4498,20 @@
           <w:szCs w:val="21"/>
         </w:rPr>
         <w:t xml:space="preserve">Cost attribution per tenant, per workflow, per model — expect a question about who pays for a runaway agent</w:t>
+      </w:r>
+    </w:p>
+    <w:p>
+      <w:pPr>
+        <w:spacing w:after="120" w:before="0"/>
+        <w:ind w:left="560"/>
+      </w:pPr>
+      <w:r>
+        <w:rPr>
+          <w:i/>
+          <w:color w:val="2E5C8A"/>
+          <w:sz w:val="18"/>
+        </w:rPr>
+        <w:t>→ Read: agent_platform/docs/05 §4 — named gap (cost attribution by tenant/workflow/model)</w:t>
       </w:r>
     </w:p>
     <w:p>
@@ -3275,6 +4549,20 @@
     </w:p>
     <w:p>
       <w:pPr>
+        <w:spacing w:after="120" w:before="0"/>
+        <w:ind w:left="560"/>
+      </w:pPr>
+      <w:r>
+        <w:rPr>
+          <w:i/>
+          <w:color w:val="2E5C8A"/>
+          <w:sz w:val="18"/>
+        </w:rPr>
+        <w:t>→ Read: cross_cutting_prep/02 §3 — only a single-provider failure limiter exists, no failover to a second provider</w:t>
+      </w:r>
+    </w:p>
+    <w:p>
+      <w:pPr>
         <w:pStyle w:val="ListParagraph"/>
         <w:numPr>
           <w:ilvl w:val="0"/>
@@ -3292,6 +4580,20 @@
     </w:p>
     <w:p>
       <w:pPr>
+        <w:spacing w:after="120" w:before="0"/>
+        <w:ind w:left="560"/>
+      </w:pPr>
+      <w:r>
+        <w:rPr>
+          <w:i/>
+          <w:color w:val="2E5C8A"/>
+          <w:sz w:val="18"/>
+        </w:rPr>
+        <w:t>→ Read: cross_cutting_prep/02 §4 — partial: both search methods exist, not wired as an explicit fallback with a user-facing note</w:t>
+      </w:r>
+    </w:p>
+    <w:p>
+      <w:pPr>
         <w:pStyle w:val="ListParagraph"/>
         <w:numPr>
           <w:ilvl w:val="0"/>
@@ -3309,6 +4611,20 @@
     </w:p>
     <w:p>
       <w:pPr>
+        <w:spacing w:after="120" w:before="0"/>
+        <w:ind w:left="560"/>
+      </w:pPr>
+      <w:r>
+        <w:rPr>
+          <w:i/>
+          <w:color w:val="2E5C8A"/>
+          <w:sz w:val="18"/>
+        </w:rPr>
+        <w:t>→ Read: agent_platform/docs/04 §3.2 (the connector layer isn't built at all, so this can't exist yet)</w:t>
+      </w:r>
+    </w:p>
+    <w:p>
+      <w:pPr>
         <w:pStyle w:val="ListParagraph"/>
         <w:numPr>
           <w:ilvl w:val="0"/>
@@ -3326,6 +4642,20 @@
     </w:p>
     <w:p>
       <w:pPr>
+        <w:spacing w:after="120" w:before="0"/>
+        <w:ind w:left="560"/>
+      </w:pPr>
+      <w:r>
+        <w:rPr>
+          <w:i/>
+          <w:color w:val="2E5C8A"/>
+          <w:sz w:val="18"/>
+        </w:rPr>
+        <w:t>→ Read: enterprise_rag_platform/docs/01-theory.md §8 — built (refuse cleanly and escalate to a human)</w:t>
+      </w:r>
+    </w:p>
+    <w:p>
+      <w:pPr>
         <w:pStyle w:val="ListParagraph"/>
         <w:numPr>
           <w:ilvl w:val="0"/>
@@ -3343,6 +4673,20 @@
     </w:p>
     <w:p>
       <w:pPr>
+        <w:spacing w:after="120" w:before="0"/>
+        <w:ind w:left="560"/>
+      </w:pPr>
+      <w:r>
+        <w:rPr>
+          <w:i/>
+          <w:color w:val="2E5C8A"/>
+          <w:sz w:val="18"/>
+        </w:rPr>
+        <w:t>→ Read: enterprise_rag_platform (a failure limiter, built) + cross_cutting_prep/02 §5 (the bulkhead pattern specifically, never named)</w:t>
+      </w:r>
+    </w:p>
+    <w:p>
+      <w:pPr>
         <w:pStyle w:val="ListParagraph"/>
         <w:numPr>
           <w:ilvl w:val="0"/>
@@ -3356,6 +4700,20 @@
           <w:szCs w:val="21"/>
         </w:rPr>
         <w:t xml:space="preserve">Every autonomous path needs a human escape hatch, plus a global kill switch per workflow and per tenant</w:t>
+      </w:r>
+    </w:p>
+    <w:p>
+      <w:pPr>
+        <w:spacing w:after="120" w:before="0"/>
+        <w:ind w:left="560"/>
+      </w:pPr>
+      <w:r>
+        <w:rPr>
+          <w:i/>
+          <w:color w:val="2E5C8A"/>
+          <w:sz w:val="18"/>
+        </w:rPr>
+        <w:t>→ Read: agent_platform (a human approval step, built) + cross_cutting_prep/02 §6 (an emergency kill switch, distinct from staged rollout)</w:t>
       </w:r>
     </w:p>
     <w:p>
@@ -3393,6 +4751,20 @@
     </w:p>
     <w:p>
       <w:pPr>
+        <w:spacing w:after="120" w:before="0"/>
+        <w:ind w:left="560"/>
+      </w:pPr>
+      <w:r>
+        <w:rPr>
+          <w:i/>
+          <w:color w:val="2E5C8A"/>
+          <w:sz w:val="18"/>
+        </w:rPr>
+        <w:t>→ Read: enterprise_rag_platform (routing by difficulty, built) + agent_platform/docs/05 §5 (the planner isn't real model-driven routing yet, gap)</w:t>
+      </w:r>
+    </w:p>
+    <w:p>
+      <w:pPr>
         <w:pStyle w:val="ListParagraph"/>
         <w:numPr>
           <w:ilvl w:val="0"/>
@@ -3410,6 +4782,20 @@
     </w:p>
     <w:p>
       <w:pPr>
+        <w:spacing w:after="120" w:before="0"/>
+        <w:ind w:left="560"/>
+      </w:pPr>
+      <w:r>
+        <w:rPr>
+          <w:i/>
+          <w:color w:val="2E5C8A"/>
+          <w:sz w:val="18"/>
+        </w:rPr>
+        <w:t>→ Read: enterprise_rag_platform (an exact-match cache, built) + cross_cutting_prep/03 §1 (semantic caching, not built)</w:t>
+      </w:r>
+    </w:p>
+    <w:p>
+      <w:pPr>
         <w:pStyle w:val="ListParagraph"/>
         <w:numPr>
           <w:ilvl w:val="0"/>
@@ -3427,6 +4813,20 @@
     </w:p>
     <w:p>
       <w:pPr>
+        <w:spacing w:after="120" w:before="0"/>
+        <w:ind w:left="560"/>
+      </w:pPr>
+      <w:r>
+        <w:rPr>
+          <w:i/>
+          <w:color w:val="2E5C8A"/>
+          <w:sz w:val="18"/>
+        </w:rPr>
+        <w:t>→ Read: cross_cutting_prep/03 §2 — not built anywhere; every project returns a complete answer in one shot</w:t>
+      </w:r>
+    </w:p>
+    <w:p>
+      <w:pPr>
         <w:pStyle w:val="ListParagraph"/>
         <w:numPr>
           <w:ilvl w:val="0"/>
@@ -3444,6 +4844,20 @@
     </w:p>
     <w:p>
       <w:pPr>
+        <w:spacing w:after="120" w:before="0"/>
+        <w:ind w:left="560"/>
+      </w:pPr>
+      <w:r>
+        <w:rPr>
+          <w:i/>
+          <w:color w:val="2E5C8A"/>
+          <w:sz w:val="18"/>
+        </w:rPr>
+        <w:t>→ Read: enterprise_rag_platform/docs/06-architecture-end-to-end.md §5 — partial, an open question whether independent calls truly run concurrently</w:t>
+      </w:r>
+    </w:p>
+    <w:p>
+      <w:pPr>
         <w:pStyle w:val="ListParagraph"/>
         <w:numPr>
           <w:ilvl w:val="0"/>
@@ -3457,6 +4871,20 @@
           <w:szCs w:val="21"/>
         </w:rPr>
         <w:t xml:space="preserve">Set and enforce per-run token and cost budgets, and make the ceiling a tenant-level configuration</w:t>
+      </w:r>
+    </w:p>
+    <w:p>
+      <w:pPr>
+        <w:spacing w:after="120" w:before="0"/>
+        <w:ind w:left="560"/>
+      </w:pPr>
+      <w:r>
+        <w:rPr>
+          <w:i/>
+          <w:color w:val="2E5C8A"/>
+          <w:sz w:val="18"/>
+        </w:rPr>
+        <w:t>→ Read: enterprise_rag_platform and agent_platform — both built (a per-run cost/spend ceiling)</w:t>
       </w:r>
     </w:p>
     <w:p>
@@ -3528,6 +4956,20 @@
     </w:p>
     <w:p>
       <w:pPr>
+        <w:spacing w:after="120" w:before="0"/>
+        <w:ind w:left="560"/>
+      </w:pPr>
+      <w:r>
+        <w:rPr>
+          <w:i/>
+          <w:color w:val="2E5C8A"/>
+          <w:sz w:val="18"/>
+        </w:rPr>
+        <w:t>→ Read: enterprise_rag_platform/docs/10 §1 — concept-prep, not built</w:t>
+      </w:r>
+    </w:p>
+    <w:p>
+      <w:pPr>
         <w:pStyle w:val="ListParagraph"/>
         <w:numPr>
           <w:ilvl w:val="0"/>
@@ -3545,6 +4987,20 @@
     </w:p>
     <w:p>
       <w:pPr>
+        <w:spacing w:after="120" w:before="0"/>
+        <w:ind w:left="560"/>
+      </w:pPr>
+      <w:r>
+        <w:rPr>
+          <w:i/>
+          <w:color w:val="2E5C8A"/>
+          <w:sz w:val="18"/>
+        </w:rPr>
+        <w:t>→ Read: enterprise_rag_platform/docs/10 §1 + cross_cutting_prep/02 §1 (as a standard trace attribute)</w:t>
+      </w:r>
+    </w:p>
+    <w:p>
+      <w:pPr>
         <w:pStyle w:val="ListParagraph"/>
         <w:numPr>
           <w:ilvl w:val="0"/>
@@ -3562,6 +5018,20 @@
     </w:p>
     <w:p>
       <w:pPr>
+        <w:spacing w:after="120" w:before="0"/>
+        <w:ind w:left="560"/>
+      </w:pPr>
+      <w:r>
+        <w:rPr>
+          <w:i/>
+          <w:color w:val="2E5C8A"/>
+          <w:sz w:val="18"/>
+        </w:rPr>
+        <w:t>→ Read: enterprise_rag_platform/docs/10 §1 — covers treating prompts as versioned artifacts; the specific template-testing detail isn't spelled out separately</w:t>
+      </w:r>
+    </w:p>
+    <w:p>
+      <w:pPr>
         <w:pStyle w:val="ListParagraph"/>
         <w:numPr>
           <w:ilvl w:val="0"/>
@@ -3575,6 +5045,20 @@
           <w:szCs w:val="21"/>
         </w:rPr>
         <w:t xml:space="preserve">The same treatment applies to tool definitions, guardrail policies, and retrieval configuration — the whole agent config is the artefact</w:t>
+      </w:r>
+    </w:p>
+    <w:p>
+      <w:pPr>
+        <w:spacing w:after="120" w:before="0"/>
+        <w:ind w:left="560"/>
+      </w:pPr>
+      <w:r>
+        <w:rPr>
+          <w:i/>
+          <w:color w:val="2E5C8A"/>
+          <w:sz w:val="18"/>
+        </w:rPr>
+        <w:t>→ Read: enterprise_rag_platform/docs/10 §1 (generalizes to the rest of the configuration) + delivery_framework_platform (a reusable asset library, loosely)</w:t>
       </w:r>
     </w:p>
     <w:p>
@@ -3612,6 +5096,20 @@
     </w:p>
     <w:p>
       <w:pPr>
+        <w:spacing w:after="120" w:before="0"/>
+        <w:ind w:left="560"/>
+      </w:pPr>
+      <w:r>
+        <w:rPr>
+          <w:i/>
+          <w:color w:val="2E5C8A"/>
+          <w:sz w:val="18"/>
+        </w:rPr>
+        <w:t>→ Read: enterprise_rag_platform/docs/10 §1 — the gate before promotion</w:t>
+      </w:r>
+    </w:p>
+    <w:p>
+      <w:pPr>
         <w:pStyle w:val="ListParagraph"/>
         <w:numPr>
           <w:ilvl w:val="0"/>
@@ -3629,6 +5127,20 @@
     </w:p>
     <w:p>
       <w:pPr>
+        <w:spacing w:after="120" w:before="0"/>
+        <w:ind w:left="560"/>
+      </w:pPr>
+      <w:r>
+        <w:rPr>
+          <w:i/>
+          <w:color w:val="2E5C8A"/>
+          <w:sz w:val="18"/>
+        </w:rPr>
+        <w:t>→ Read: enterprise_rag_platform/docs/10 §1 — shadow rollout first</w:t>
+      </w:r>
+    </w:p>
+    <w:p>
+      <w:pPr>
         <w:pStyle w:val="ListParagraph"/>
         <w:numPr>
           <w:ilvl w:val="0"/>
@@ -3646,6 +5158,20 @@
     </w:p>
     <w:p>
       <w:pPr>
+        <w:spacing w:after="120" w:before="0"/>
+        <w:ind w:left="560"/>
+      </w:pPr>
+      <w:r>
+        <w:rPr>
+          <w:i/>
+          <w:color w:val="2E5C8A"/>
+          <w:sz w:val="18"/>
+        </w:rPr>
+        <w:t>→ Read: enterprise_rag_platform/docs/10 §1 — a small-scale release next</w:t>
+      </w:r>
+    </w:p>
+    <w:p>
+      <w:pPr>
         <w:pStyle w:val="ListParagraph"/>
         <w:numPr>
           <w:ilvl w:val="0"/>
@@ -3663,6 +5189,20 @@
     </w:p>
     <w:p>
       <w:pPr>
+        <w:spacing w:after="120" w:before="0"/>
+        <w:ind w:left="560"/>
+      </w:pPr>
+      <w:r>
+        <w:rPr>
+          <w:i/>
+          <w:color w:val="2E5C8A"/>
+          <w:sz w:val="18"/>
+        </w:rPr>
+        <w:t>→ Read: enterprise_rag_platform/docs/10 §1 — promote or roll back, instantly and cheaply</w:t>
+      </w:r>
+    </w:p>
+    <w:p>
+      <w:pPr>
         <w:pStyle w:val="ListParagraph"/>
         <w:numPr>
           <w:ilvl w:val="0"/>
@@ -3676,6 +5216,20 @@
           <w:szCs w:val="21"/>
         </w:rPr>
         <w:t xml:space="preserve">Nightly regression runs, because model providers change models underneath you without warning</w:t>
+      </w:r>
+    </w:p>
+    <w:p>
+      <w:pPr>
+        <w:spacing w:after="120" w:before="0"/>
+        <w:ind w:left="560"/>
+      </w:pPr>
+      <w:r>
+        <w:rPr>
+          <w:i/>
+          <w:color w:val="2E5C8A"/>
+          <w:sz w:val="18"/>
+        </w:rPr>
+        <w:t>→ Read: cross_cutting_prep/03 §3 — a distinct trigger (the vendor silently changing something), not covered elsewhere</w:t>
       </w:r>
     </w:p>
     <w:p>
@@ -3713,6 +5267,20 @@
     </w:p>
     <w:p>
       <w:pPr>
+        <w:spacing w:after="120" w:before="0"/>
+        <w:ind w:left="560"/>
+      </w:pPr>
+      <w:r>
+        <w:rPr>
+          <w:i/>
+          <w:color w:val="2E5C8A"/>
+          <w:sz w:val="18"/>
+        </w:rPr>
+        <w:t>→ Read: enterprise_rag_platform/docs/10 §1 (the A/B testing section)</w:t>
+      </w:r>
+    </w:p>
+    <w:p>
+      <w:pPr>
         <w:pStyle w:val="ListParagraph"/>
         <w:numPr>
           <w:ilvl w:val="0"/>
@@ -3730,6 +5298,20 @@
     </w:p>
     <w:p>
       <w:pPr>
+        <w:spacing w:after="120" w:before="0"/>
+        <w:ind w:left="560"/>
+      </w:pPr>
+      <w:r>
+        <w:rPr>
+          <w:i/>
+          <w:color w:val="2E5C8A"/>
+          <w:sz w:val="18"/>
+        </w:rPr>
+        <w:t>→ Read: enterprise_rag_platform/docs/10 §1 (same section)</w:t>
+      </w:r>
+    </w:p>
+    <w:p>
+      <w:pPr>
         <w:pStyle w:val="ListParagraph"/>
         <w:numPr>
           <w:ilvl w:val="0"/>
@@ -3747,6 +5329,20 @@
     </w:p>
     <w:p>
       <w:pPr>
+        <w:spacing w:after="120" w:before="0"/>
+        <w:ind w:left="560"/>
+      </w:pPr>
+      <w:r>
+        <w:rPr>
+          <w:i/>
+          <w:color w:val="2E5C8A"/>
+          <w:sz w:val="18"/>
+        </w:rPr>
+        <w:t>→ Read: cross_cutting_prep/03 §4 — statistical rigor not addressed elsewhere</w:t>
+      </w:r>
+    </w:p>
+    <w:p>
+      <w:pPr>
         <w:pStyle w:val="ListParagraph"/>
         <w:numPr>
           <w:ilvl w:val="0"/>
@@ -3764,6 +5360,20 @@
     </w:p>
     <w:p>
       <w:pPr>
+        <w:spacing w:after="120" w:before="0"/>
+        <w:ind w:left="560"/>
+      </w:pPr>
+      <w:r>
+        <w:rPr>
+          <w:i/>
+          <w:color w:val="2E5C8A"/>
+          <w:sz w:val="18"/>
+        </w:rPr>
+        <w:t>→ Read: enterprise_rag_platform/docs/10 §1 + delivery_framework_platform/docs/05 §1 (a rollback attestation, not yet an actual mechanism)</w:t>
+      </w:r>
+    </w:p>
+    <w:p>
+      <w:pPr>
         <w:pStyle w:val="ListParagraph"/>
         <w:numPr>
           <w:ilvl w:val="0"/>
@@ -3777,6 +5387,20 @@
           <w:szCs w:val="21"/>
         </w:rPr>
         <w:t xml:space="preserve">Keep an immutable record of which version served which run, for audit and incident review</w:t>
+      </w:r>
+    </w:p>
+    <w:p>
+      <w:pPr>
+        <w:spacing w:after="120" w:before="0"/>
+        <w:ind w:left="560"/>
+      </w:pPr>
+      <w:r>
+        <w:rPr>
+          <w:i/>
+          <w:color w:val="2E5C8A"/>
+          <w:sz w:val="18"/>
+        </w:rPr>
+        <w:t>→ Read: enterprise_rag_platform/docs/10 §1 (implied via a versioned identifier) + cross_cutting_prep/02 §1 (linking that to a standard trace ID)</w:t>
       </w:r>
     </w:p>
     <w:p>
@@ -3814,6 +5438,20 @@
     </w:p>
     <w:p>
       <w:pPr>
+        <w:spacing w:after="120" w:before="0"/>
+        <w:ind w:left="560"/>
+      </w:pPr>
+      <w:r>
+        <w:rPr>
+          <w:i/>
+          <w:color w:val="2E5C8A"/>
+          <w:sz w:val="18"/>
+        </w:rPr>
+        <w:t>→ Read: cross_cutting_prep/03 §5 — the one evaluation layer with no home until this doc (basic output-shape testing)</w:t>
+      </w:r>
+    </w:p>
+    <w:p>
+      <w:pPr>
         <w:pStyle w:val="ListParagraph"/>
         <w:numPr>
           <w:ilvl w:val="0"/>
@@ -3831,6 +5469,20 @@
     </w:p>
     <w:p>
       <w:pPr>
+        <w:spacing w:after="120" w:before="0"/>
+        <w:ind w:left="560"/>
+      </w:pPr>
+      <w:r>
+        <w:rPr>
+          <w:i/>
+          <w:color w:val="2E5C8A"/>
+          <w:sz w:val="18"/>
+        </w:rPr>
+        <w:t>→ Read: enterprise_rag_platform (retrieval quality, built) + agent_platform (tool selection: a fixed planner, not real selection, partial)</w:t>
+      </w:r>
+    </w:p>
+    <w:p>
+      <w:pPr>
         <w:pStyle w:val="ListParagraph"/>
         <w:numPr>
           <w:ilvl w:val="0"/>
@@ -3848,6 +5500,20 @@
     </w:p>
     <w:p>
       <w:pPr>
+        <w:spacing w:after="120" w:before="0"/>
+        <w:ind w:left="560"/>
+      </w:pPr>
+      <w:r>
+        <w:rPr>
+          <w:i/>
+          <w:color w:val="2E5C8A"/>
+          <w:sz w:val="18"/>
+        </w:rPr>
+        <w:t>→ Read: enterprise_rag_platform (built) + delivery_framework_platform (a placeholder score, not yet computed)</w:t>
+      </w:r>
+    </w:p>
+    <w:p>
+      <w:pPr>
         <w:pStyle w:val="ListParagraph"/>
         <w:numPr>
           <w:ilvl w:val="0"/>
@@ -3865,6 +5531,20 @@
     </w:p>
     <w:p>
       <w:pPr>
+        <w:spacing w:after="120" w:before="0"/>
+        <w:ind w:left="560"/>
+      </w:pPr>
+      <w:r>
+        <w:rPr>
+          <w:i/>
+          <w:color w:val="2E5C8A"/>
+          <w:sz w:val="18"/>
+        </w:rPr>
+        <w:t>→ Read: enterprise_rag_platform (permission-boundary testing via personas, built) + delivery_framework_platform/docs/05 §1 (the evidence bar doesn't force this) + agent_platform/docs/05 §1 (prompt injection specifically, not defended)</w:t>
+      </w:r>
+    </w:p>
+    <w:p>
+      <w:pPr>
         <w:pStyle w:val="ListParagraph"/>
         <w:numPr>
           <w:ilvl w:val="0"/>
@@ -3878,6 +5558,20 @@
           <w:szCs w:val="21"/>
         </w:rPr>
         <w:t xml:space="preserve">Production: sampled human review plus continuous automated scoring on live traffic</w:t>
+      </w:r>
+    </w:p>
+    <w:p>
+      <w:pPr>
+        <w:spacing w:after="120" w:before="0"/>
+        <w:ind w:left="560"/>
+      </w:pPr>
+      <w:r>
+        <w:rPr>
+          <w:i/>
+          <w:color w:val="2E5C8A"/>
+          <w:sz w:val="18"/>
+        </w:rPr>
+        <w:t>→ Read: enterprise_rag_platform/docs/07 §4.5 (not built, verbal only) + docs/10 §3 (escalation feeding evaluation as the missing signal)</w:t>
       </w:r>
     </w:p>
     <w:p>
@@ -4724,6 +6418,20 @@
         </w:tc>
       </w:tr>
     </w:tbl>
+    <w:p>
+      <w:pPr>
+        <w:spacing w:after="120" w:before="0"/>
+        <w:ind w:left="560"/>
+      </w:pPr>
+      <w:r>
+        <w:rPr>
+          <w:i/>
+          <w:color w:val="2E5C8A"/>
+          <w:sz w:val="18"/>
+        </w:rPr>
+        <w:t>→ Read: enterprise_rag_platform/docs/01-theory.md (access control, retrieval-vs-fine-tuning, chunking, search) · enterprise_rag_platform/Scale_Optimization.md (vector store build-vs-buy) · enterprise_rag_platform/docs/09 (the multi-agent trade-off) · agent_platform/docs/05 §5 (the cheat sheet's actual default: one agent with good tools) · cross_cutting_prep/03 §6 (build vs. buy, argued as its own decision across the whole stack) · agent_platform/docs/04 §3.4 (sync vs. async, human in the loop)</w:t>
+      </w:r>
+    </w:p>
     <w:p/>
     <w:p>
       <w:pPr>

</xml_diff>

<commit_message>
docs: update DevRev-SystemDesign-Prep.docx and related markdown files to reflect changes in section references, enhance clarity on A/B testing methodologies, and improve observability standards for multi-provider failover. This includes restructuring content for better readability and ensuring comprehensive coverage of system design principles across the documentation.
</commit_message>
<xml_diff>
--- a/DevRev_Preparation/System_Design_Round/DevRev-SystemDesign-Prep.docx
+++ b/DevRev_Preparation/System_Design_Round/DevRev-SystemDesign-Prep.docx
@@ -5338,7 +5338,7 @@
           <w:color w:val="2E5C8A"/>
           <w:sz w:val="18"/>
         </w:rPr>
-        <w:t>→ Read: cross_cutting_prep/03 §4 — statistical rigor not addressed elsewhere</w:t>
+        <w:t>→ Read: cross_cutting_prep/03 §5 — statistical rigor not addressed elsewhere</w:t>
       </w:r>
     </w:p>
     <w:p>
@@ -5447,7 +5447,7 @@
           <w:color w:val="2E5C8A"/>
           <w:sz w:val="18"/>
         </w:rPr>
-        <w:t>→ Read: cross_cutting_prep/03 §5 — the one evaluation layer with no home until this doc (basic output-shape testing)</w:t>
+        <w:t>→ Read: cross_cutting_prep/03 §6 — the one evaluation layer with no home until this doc (basic output-shape testing)</w:t>
       </w:r>
     </w:p>
     <w:p>
@@ -6429,7 +6429,7 @@
           <w:color w:val="2E5C8A"/>
           <w:sz w:val="18"/>
         </w:rPr>
-        <w:t>→ Read: enterprise_rag_platform/docs/01-theory.md (access control, retrieval-vs-fine-tuning, chunking, search) · enterprise_rag_platform/Scale_Optimization.md (vector store build-vs-buy) · enterprise_rag_platform/docs/09 (the multi-agent trade-off) · agent_platform/docs/05 §5 (the cheat sheet's actual default: one agent with good tools) · cross_cutting_prep/03 §6 (build vs. buy, argued as its own decision across the whole stack) · agent_platform/docs/04 §3.4 (sync vs. async, human in the loop)</w:t>
+        <w:t>→ Read: enterprise_rag_platform/docs/01-theory.md (access control, retrieval-vs-fine-tuning, chunking, search) · enterprise_rag_platform/Scale_Optimization.md (vector store build-vs-buy) · enterprise_rag_platform/docs/09 (the multi-agent trade-off) · agent_platform/docs/05 §5 (the cheat sheet's actual default: one agent with good tools) · cross_cutting_prep/03 §7 (build vs. buy, argued as its own decision across the whole stack) · agent_platform/docs/04 §3.4 (sync vs. async, human in the loop)</w:t>
       </w:r>
     </w:p>
     <w:p/>

</xml_diff>